<commit_message>
update: added new documentation
</commit_message>
<xml_diff>
--- a/Administratie/Afstudeervoorstel_1023891.docx
+++ b/Administratie/Afstudeervoorstel_1023891.docx
@@ -5710,14 +5710,6 @@
         <w:gridCol w:w="6236"/>
       </w:tblGrid>
       <w:tr>
-        <w:tblPrEx>
-          <w:tblCellMar>
-            <w:top w:w="0" w:type="dxa"/>
-            <w:left w:w="108" w:type="dxa"/>
-            <w:bottom w:w="0" w:type="dxa"/>
-            <w:right w:w="108" w:type="dxa"/>
-          </w:tblCellMar>
-        </w:tblPrEx>
         <w:trPr>
           <w:cantSplit/>
           <w:jc w:val="center"/>
@@ -7948,35 +7940,28 @@
         <w:rPr>
           <w:rFonts w:hint="default"/>
         </w:rPr>
-        <w:t xml:space="preserve">Ik plan en bewaak het project, communiceer met stakeholders en werk volgens de ontwikkel- en kwaliteitsafspraken van het bedrijf. Voor versiebeheer maak ik gebruik van </w:t>
-      </w:r>
-      <w:r>
-        <w:rPr>
-          <w:rFonts w:hint="default"/>
-          <w:b/>
-          <w:bCs/>
-        </w:rPr>
-        <w:t>GitHub</w:t>
-      </w:r>
+        <w:t>Ik plan en bewaak het project, communicee</w:t>
+      </w:r>
+      <w:bookmarkStart w:id="0" w:name="_GoBack"/>
+      <w:bookmarkEnd w:id="0"/>
       <w:r>
         <w:rPr>
           <w:rFonts w:hint="default"/>
         </w:rPr>
-        <w:t xml:space="preserve">. Daarnaast gebruik ik </w:t>
+        <w:t>r met stakeholders, werk volgens de ontwikkel- en</w:t>
       </w:r>
       <w:r>
         <w:rPr>
           <w:rFonts w:hint="default"/>
-          <w:b/>
-          <w:bCs/>
+          <w:lang w:val="en-US"/>
         </w:rPr>
-        <w:t>GitHub Workflows</w:t>
+        <w:t xml:space="preserve"> </w:t>
       </w:r>
       <w:r>
         <w:rPr>
           <w:rFonts w:hint="default"/>
         </w:rPr>
-        <w:t xml:space="preserve"> om onderdelen van het ontwikkelproces te automatiseren en de kwaliteit van de code te bewaken. Voortgang, keuzes, wijzigingen en feedback leg ik traceerbaar vast.</w:t>
+        <w:t>kwaliteitsafspraken van het bedrijf en leg voortgang, keuzes en feedback traceerbaar vast.</w:t>
       </w:r>
     </w:p>
     <w:p>
@@ -7994,8 +7979,6 @@
       <w:r>
         <w:t>Ik analyseer requirements, gebruikersbehoeften, systemen, data en kwaliteitsaspecten en gebruik onderzoek om de kernproblemen en technische randvoorwaarden vast te stellen.</w:t>
       </w:r>
-      <w:bookmarkStart w:id="0" w:name="_GoBack"/>
-      <w:bookmarkEnd w:id="0"/>
     </w:p>
     <w:p>
       <w:pPr>
@@ -8534,14 +8517,6 @@
         </w:tc>
       </w:tr>
       <w:tr>
-        <w:tblPrEx>
-          <w:tblCellMar>
-            <w:top w:w="0" w:type="dxa"/>
-            <w:left w:w="108" w:type="dxa"/>
-            <w:bottom w:w="0" w:type="dxa"/>
-            <w:right w:w="108" w:type="dxa"/>
-          </w:tblCellMar>
-        </w:tblPrEx>
         <w:trPr>
           <w:cantSplit/>
           <w:jc w:val="center"/>
@@ -9995,14 +9970,6 @@
         <w:gridCol w:w="6236"/>
       </w:tblGrid>
       <w:tr>
-        <w:tblPrEx>
-          <w:tblCellMar>
-            <w:top w:w="0" w:type="dxa"/>
-            <w:left w:w="108" w:type="dxa"/>
-            <w:bottom w:w="0" w:type="dxa"/>
-            <w:right w:w="108" w:type="dxa"/>
-          </w:tblCellMar>
-        </w:tblPrEx>
         <w:trPr>
           <w:cantSplit/>
           <w:jc w:val="center"/>
@@ -11156,10 +11123,6 @@
 </file>
 
 <file path=customXml/item2.xml><?xml version="1.0" encoding="utf-8"?>
-<b:Sources xmlns:b="http://schemas.openxmlformats.org/officeDocument/2006/bibliography" xmlns="http://schemas.openxmlformats.org/officeDocument/2006/bibliography" SelectedStyle="\APASixthEditionOfficeOnline.xsl" StyleName="APA" Version="6"/>
-</file>
-
-<file path=customXml/item3.xml><?xml version="1.0" encoding="utf-8"?>
 <CoverPageProperties xmlns="http://schemas.microsoft.com/office/2006/coverPageProps">
   <PublishDate>2024-09-07T00:00:00</PublishDate>
   <Abstract/>
@@ -11168,6 +11131,10 @@
   <CompanyFax/>
   <CompanyEmail/>
 </CoverPageProperties>
+</file>
+
+<file path=customXml/item3.xml><?xml version="1.0" encoding="utf-8"?>
+<b:Sources xmlns:b="http://schemas.openxmlformats.org/officeDocument/2006/bibliography" xmlns="http://schemas.openxmlformats.org/officeDocument/2006/bibliography" SelectedStyle="\APASixthEditionOfficeOnline.xsl" StyleName="APA" Version="6"/>
 </file>
 
 <file path=customXml/itemProps1.xml><?xml version="1.0" encoding="utf-8"?>
@@ -11179,13 +11146,13 @@
 </file>
 
 <file path=customXml/itemProps2.xml><?xml version="1.0" encoding="utf-8"?>
-<ds:datastoreItem xmlns:ds="http://schemas.openxmlformats.org/officeDocument/2006/customXml" ds:itemID="{32C00AC3-8463-426B-ABA9-52FE0EB7ACAA}">
+<ds:datastoreItem xmlns:ds="http://schemas.openxmlformats.org/officeDocument/2006/customXml" ds:itemID="{55AF091B-3C7A-41E3-B477-F2FDAA23CFDA}">
   <ds:schemaRefs/>
 </ds:datastoreItem>
 </file>
 
 <file path=customXml/itemProps3.xml><?xml version="1.0" encoding="utf-8"?>
-<ds:datastoreItem xmlns:ds="http://schemas.openxmlformats.org/officeDocument/2006/customXml" ds:itemID="{55AF091B-3C7A-41E3-B477-F2FDAA23CFDA}">
+<ds:datastoreItem xmlns:ds="http://schemas.openxmlformats.org/officeDocument/2006/customXml" ds:itemID="{32C00AC3-8463-426B-ABA9-52FE0EB7ACAA}">
   <ds:schemaRefs/>
 </ds:datastoreItem>
 </file>
</xml_diff>